<commit_message>
court(wisctapp): petition-for-discretionary-review latex gated: the model's bracket break now matches typst (373/373 lines) (fb-595.54.46)
Co-Authored-By: Claude Opus 5.5 <noreply@anthropic.com>
</commit_message>
<xml_diff>
--- a/courts/seventh-circuit/wisconsin/state/court-of-appeals/petition-for-discretionary-review/usage/OUTPUT-petition-for-discretionary-review.docx
+++ b/courts/seventh-circuit/wisconsin/state/court-of-appeals/petition-for-discretionary-review/usage/OUTPUT-petition-for-discretionary-review.docx
@@ -1144,10 +1144,7 @@
         <w:ind w:left="780" w:right="720" w:hanging="390"/>
       </w:pPr>
       <w:r>
-        <w:t xml:space="preserve">I.</w:t>
-      </w:r>
-      <w:r>
-        <w:t xml:space="preserve"> </w:t>
+        <w:t xml:space="preserve">I. </w:t>
       </w:r>
       <w:r>
         <w:t xml:space="preserve">Ms.</w:t>
@@ -1328,10 +1325,7 @@
         <w:ind w:left="780" w:right="720" w:hanging="390"/>
       </w:pPr>
       <w:r>
-        <w:t xml:space="preserve">II.</w:t>
-      </w:r>
-      <w:r>
-        <w:t xml:space="preserve"> </w:t>
+        <w:t xml:space="preserve">II. </w:t>
       </w:r>
       <w:r>
         <w:t xml:space="preserve">An</w:t>
@@ -1464,10 +1458,7 @@
         <w:ind w:left="780" w:right="720" w:hanging="390"/>
       </w:pPr>
       <w:r>
-        <w:t xml:space="preserve">III.</w:t>
-      </w:r>
-      <w:r>
-        <w:t xml:space="preserve"> </w:t>
+        <w:t xml:space="preserve">III. </w:t>
       </w:r>
       <w:r>
         <w:t xml:space="preserve">Without</w:t>
@@ -1763,7 +1754,7 @@
         <w:t xml:space="preserve">Lassa v. Rongstad</w:t>
       </w:r>
       <w:r>
-        <w:t xml:space="preserve">, 2006 WI 105, ¶¶ 88–89, 294 Wis. 2d 187, 718 N.W.2d 673.</w:t>
+        <w:t xml:space="preserve">, 2006 WI 105, ¶¶ 88–⁠89, 294 Wis. 2d 187, 718 N.W.2d 673.</w:t>
       </w:r>
     </w:p>
     <w:p>
@@ -1929,7 +1920,7 @@
         <w:pStyle w:val="BodyText"/>
       </w:pPr>
       <w:r>
-        <w:t xml:space="preserve">But the Circuit Court held that other portions of Ms. Johnson’s posts—in particular, the phrases “woke,” “god complex,” “white savior,” “woke lunatics,” and “bullies”—are actionable for defamation because, in the Circuit Court’s view, they are “mixed opinions” that “impl[y] the allegation of undisclosed defamatory facts,” namely that MacCudden “abuses her position of power over students” and is “unfit[ ] to teach.” App. 9–10.</w:t>
+        <w:t xml:space="preserve">But the Circuit Court held that other portions of Ms. Johnson’s posts—in particular, the phrases “woke,” “god complex,” “white savior,” “woke lunatics,” and “bullies”—are actionable for defamation because, in the Circuit Court’s view, they are “mixed opinions” that “impl[y] the allegation of undisclosed defamatory facts,” namely that MacCudden “abuses her position of power over students” and is “unfit[ ] to teach.” App. 9–10.</w:t>
       </w:r>
     </w:p>
     <w:p>
@@ -2062,6 +2053,10 @@
         <w:t xml:space="preserve">I.</w:t>
       </w:r>
       <w:r>
+        <w:rPr>
+          <w:b/>
+          <w:bCs/>
+        </w:rPr>
         <w:tab/>
       </w:r>
       <w:r>
@@ -2509,7 +2504,7 @@
         <w:t xml:space="preserve">Torgerson v. J./​Sentinel, Inc.</w:t>
       </w:r>
       <w:r>
-        <w:t xml:space="preserve">, 210 Wis. 2d 524, 534–35, 563 N.W.2d 472 (1997) (“If the challenged statements as a whole are not capable of a false [ ] meaning … a libel action will fail.”);</w:t>
+        <w:t xml:space="preserve">, 210 Wis. 2d 524, 534–35, 563 N.W.2d 472 (1997) (“If the challenged statements as a whole are not capable of a false [ ] meaning … a libel action will fail.”);</w:t>
       </w:r>
       <w:r>
         <w:t xml:space="preserve"> </w:t>
@@ -2632,7 +2627,7 @@
         <w:t xml:space="preserve">Stevens v. Tillman</w:t>
       </w:r>
       <w:r>
-        <w:t xml:space="preserve">, 855 F.2d 394, 402 (7th Cir. 1988), for example, Judge Easterbrook explained that calling someone a “racist” is the kind of statement that is generally “not actionable” because “[t]he word has been watered down by overuse, becoming common coin in political discourse,” and therefore it lacks a precise enough meaning to be capable of being proved false (giving examples for how it is used). Given that the word “is hurled about so indiscriminately[,] [ ] it is no more than a verbal slap in the face; the target can slap back.”</w:t>
+        <w:t xml:space="preserve">, 855 F.2d 394, 402 (7th Cir. 1988), for example, Judge Easterbrook explained that calling someone a “racist” is the kind of statement that is generally “not actionable” because “[t]he word has been watered down by overuse, becoming common coin in political discourse,” and therefore it lacks a precise enough meaning to be capable of being proved false (giving examples for how it is used). Given that the word “is hurled about so indiscriminately[,] [ ] it is no more than a verbal slap in the face; the target can slap back.”</w:t>
       </w:r>
       <w:r>
         <w:t xml:space="preserve"> </w:t>
@@ -2691,7 +2686,7 @@
         <w:tab/>
       </w:r>
       <w:r>
-        <w:t xml:space="preserve">“scam,” “rip[ ] off,” and “cheat”:</w:t>
+        <w:t xml:space="preserve">“scam,” “rip[ ] off,” and “cheat”:</w:t>
       </w:r>
       <w:r>
         <w:t xml:space="preserve"> </w:t>
@@ -3030,7 +3025,7 @@
         <w:pStyle w:val="BodyText"/>
       </w:pPr>
       <w:r>
-        <w:t xml:space="preserve">The Circuit Court wrongly held that Ms. Johnson’s posts stating that social justice coordinators like MacCudden are “woke,” have “a god complex,” and the like, are “mixed opinions” that “impl[y] the allegation of undisclosed defamatory facts,” namely that MacCudden “abuses her position of power over students” and is “unfit[ ] to teach.” App. 9–10. This holding is deeply misguided, for two independently sufficient reasons.</w:t>
+        <w:t xml:space="preserve">The Circuit Court wrongly held that Ms. Johnson’s posts stating that social justice coordinators like MacCudden are “woke,” have “a god complex,” and the like, are “mixed opinions” that “impl[y] the allegation of undisclosed defamatory facts,” namely that MacCudden “abuses her position of power over students” and is “unfit[ ] to teach.” App. 9–10. This holding is deeply misguided, for two independently sufficient reasons.</w:t>
       </w:r>
     </w:p>
     <w:p>
@@ -3038,7 +3033,7 @@
         <w:pStyle w:val="BodyText"/>
       </w:pPr>
       <w:r>
-        <w:t xml:space="preserve">First, Ms. Johnson’s posts do not remotely imply to the reader that she is asserting that MacCudden “abuses her position of power over students” or is “unfit[ ] to teach.”</w:t>
+        <w:t xml:space="preserve">First, Ms. Johnson’s posts do not remotely imply to the reader that she is asserting that MacCudden “abuses her position of power over students” or is “unfit[ ] to teach.”</w:t>
       </w:r>
       <w:r>
         <w:t xml:space="preserve"> </w:t>
@@ -3054,7 +3049,7 @@
         <w:t xml:space="preserve"> </w:t>
       </w:r>
       <w:r>
-        <w:t xml:space="preserve">As Wisconsin courts have long held, statements must be evaluated “reasonably,” as they would have been understood by “the ordinary mind,” and courts must consider “whether the meaning ascribed by [the] plaintiff[ ] is a natural and proper one.”</w:t>
+        <w:t xml:space="preserve">As Wisconsin courts have long held, statements must be evaluated “reasonably,” as they would have been understood by “the ordinary mind,” and courts must consider “whether the meaning ascribed by [the] plaintiff[ ] is a natural and proper one.”</w:t>
       </w:r>
       <w:r>
         <w:t xml:space="preserve"> </w:t>
@@ -3337,6 +3332,10 @@
         <w:t xml:space="preserve">II.</w:t>
       </w:r>
       <w:r>
+        <w:rPr>
+          <w:b/>
+          <w:bCs/>
+        </w:rPr>
         <w:tab/>
       </w:r>
       <w:r>
@@ -3631,6 +3630,10 @@
         <w:t xml:space="preserve">III.</w:t>
       </w:r>
       <w:r>
+        <w:rPr>
+          <w:b/>
+          <w:bCs/>
+        </w:rPr>
         <w:tab/>
       </w:r>
       <w:r>
@@ -5596,6 +5599,33 @@
     <w:pPr>
       <w:spacing w:before="0" w:after="0" w:line="299" w:lineRule="exact"/>
       <w:ind w:left="2160" w:hanging="720"/>
+    </w:pPr>
+  </w:style>
+  <w:style w:type="paragraph" w:customStyle="1" w:styleId="XdQuoteList1">
+    <w:name w:val="Xd Quote List 1"/>
+    <w:basedOn w:val="Normal"/>
+    <w:qFormat/>
+    <w:pPr>
+      <w:spacing w:before="0" w:after="0" w:line="299" w:lineRule="exact"/>
+      <w:ind w:left="1440" w:right="720" w:hanging="720"/>
+    </w:pPr>
+  </w:style>
+  <w:style w:type="paragraph" w:customStyle="1" w:styleId="XdQuoteList2">
+    <w:name w:val="Xd Quote List 2"/>
+    <w:basedOn w:val="Normal"/>
+    <w:qFormat/>
+    <w:pPr>
+      <w:spacing w:before="0" w:after="0" w:line="299" w:lineRule="exact"/>
+      <w:ind w:left="2160" w:right="720" w:hanging="720"/>
+    </w:pPr>
+  </w:style>
+  <w:style w:type="paragraph" w:customStyle="1" w:styleId="XdQuoteList3">
+    <w:name w:val="Xd Quote List 3"/>
+    <w:basedOn w:val="Normal"/>
+    <w:qFormat/>
+    <w:pPr>
+      <w:spacing w:before="0" w:after="0" w:line="299" w:lineRule="exact"/>
+      <w:ind w:left="2880" w:right="720" w:hanging="720"/>
     </w:pPr>
   </w:style>
   <w:style w:type="paragraph" w:customStyle="1" w:styleId="XdList1">

</xml_diff>